<commit_message>
GCN links: direct sign-up restored + 'need help' line to gcn.html
Per Thom: instead of detouring join links through the gateway page, keep
them pointing straight at the Circle sign-up and add a smaller italic
'If you need help joining or signing in, Click Here.' line beneath each,
linking to compassioncourse.org/gcn.html.

- lessons: 55 join links reverted to the Circle invite; 55 help lines added
- workbook: GCN_JOIN reverted; help paragraph added after both join lines
  (content.json + link rule); docx rebuilt

Co-Authored-By: Claude Opus 4.8 (1M context) <noreply@anthropic.com>
</commit_message>
<xml_diff>
--- a/.local-workbook/Compassion Course 2026-27 Certificate of Completion (COC) Workbook.docx
+++ b/.local-workbook/Compassion Course 2026-27 Certificate of Completion (COC) Workbook.docx
@@ -613,7 +613,7 @@
         </w:rPr>
         <w:t xml:space="preserve">Keep a small journal with you throughout the day. Make 1 to 5 entries per day that include the description of an act or words spoken by someone and what need you imagine they were trying to meet. It is SUPER important to limit the words you use to those on the </w:t>
       </w:r>
-      <w:hyperlink w:history="1" r:id="rIdbjfnekponr19ompchmq1q">
+      <w:hyperlink w:history="1" r:id="rIdspsdmv9lms-q9w-1hqu_2">
         <w:r>
           <w:rPr>
             <w:color w:val="1155CC"/>
@@ -755,7 +755,7 @@
         </w:rPr>
         <w:t xml:space="preserve">Think of someone who is close to you who is doing or saying something you don't like. See if you can figure out what need they are attempting to fulfill. Again, it is really important to limit the words you use to those on the </w:t>
       </w:r>
-      <w:hyperlink w:history="1" r:id="rIdhjpndnzpyulttkxwaqobu">
+      <w:hyperlink w:history="1" r:id="rId8chjomfmc6o3tpxy1cipw">
         <w:r>
           <w:rPr>
             <w:color w:val="1155CC"/>
@@ -1050,7 +1050,7 @@
         </w:rPr>
         <w:t xml:space="preserve">Extended registration lasts for one week. To let someone know about the course you can use the following link: </w:t>
       </w:r>
-      <w:hyperlink w:history="1" r:id="rIdtuiawh575qjtlaita4mvl">
+      <w:hyperlink w:history="1" r:id="rIdikg_o4kclur2wgwqgqz5m">
         <w:r>
           <w:rPr>
             <w:color w:val="1155CC"/>
@@ -1391,7 +1391,7 @@
         </w:rPr>
         <w:t xml:space="preserve">Keep a small journal with you throughout the day. Make 1 to 5 entries per day that include judgment words you said or were thinking of saying. Later on, when you have time, sit down with the </w:t>
       </w:r>
-      <w:hyperlink w:history="1" r:id="rIdx_twwkjug1mipxk-c3_3t">
+      <w:hyperlink w:history="1" r:id="rIdxuxcpjwhcqplyvc3yrjpg">
         <w:r>
           <w:rPr>
             <w:color w:val="1155CC"/>
@@ -1412,7 +1412,7 @@
         </w:rPr>
         <w:t xml:space="preserve"> and see if you can figure out what need of yours the judgment was (or is) related to. Remember, to successfully complete this exercise, limit the words you use to those on the </w:t>
       </w:r>
-      <w:hyperlink w:history="1" r:id="rIdg-izqzezsaov4adle9zr0">
+      <w:hyperlink w:history="1" r:id="rIdb0c5_gcoypojfmgetqlv0">
         <w:r>
           <w:rPr>
             <w:color w:val="1155CC"/>
@@ -1554,7 +1554,7 @@
         </w:rPr>
         <w:t xml:space="preserve">Keep a small journal with you throughout the day. It could be a little book, a folded piece of paper or a napkin -anything you can write on. Make 1 to 5 entries per day that include judgment words spoken by someone. Later on, when you have time, sit down with the </w:t>
       </w:r>
-      <w:hyperlink w:history="1" r:id="rIdhmdibkkfzkuhiq8apyuf3">
+      <w:hyperlink w:history="1" r:id="rIdbniiwypinllfccaqif7su">
         <w:r>
           <w:rPr>
             <w:color w:val="1155CC"/>
@@ -1575,7 +1575,7 @@
         </w:rPr>
         <w:t xml:space="preserve"> and see if you can figure out what need was unmet for them. Remember to limit the words you use to those on the </w:t>
       </w:r>
-      <w:hyperlink w:history="1" r:id="rIdnudw1t0ie-nn45unbsmu5">
+      <w:hyperlink w:history="1" r:id="rIdfsb0mhnv9l-i9o0thodnm">
         <w:r>
           <w:rPr>
             <w:color w:val="1155CC"/>
@@ -2053,7 +2053,7 @@
         </w:rPr>
         <w:t xml:space="preserve">Later on, when you have time, sit down with the </w:t>
       </w:r>
-      <w:hyperlink w:history="1" r:id="rId79yo_y7cehr0ikkovim--">
+      <w:hyperlink w:history="1" r:id="rId5fws7m0qd0tdc7whdm2qs">
         <w:r>
           <w:rPr>
             <w:color w:val="1155CC"/>
@@ -2110,7 +2110,7 @@
         </w:rPr>
         <w:t xml:space="preserve"> at the top of the </w:t>
       </w:r>
-      <w:hyperlink w:history="1" r:id="rIdymbif6cl0tfccqg5pzekg">
+      <w:hyperlink w:history="1" r:id="rIdtikspukrvf74uu7i-ldef">
         <w:r>
           <w:rPr>
             <w:color w:val="1155CC"/>
@@ -2147,7 +2147,7 @@
         </w:rPr>
         <w:t xml:space="preserve">Then look at the </w:t>
       </w:r>
-      <w:hyperlink w:history="1" r:id="rIdz-dzocrff1d85cxo1rxco">
+      <w:hyperlink w:history="1" r:id="rIdwmiyglwfk2ic6cxidmsqu">
         <w:r>
           <w:rPr>
             <w:color w:val="1155CC"/>
@@ -2168,7 +2168,7 @@
         </w:rPr>
         <w:t xml:space="preserve"> and see if you can figure out what need your feeling was about. Remember, it's VERY helpful to limit the words you use to those on the </w:t>
       </w:r>
-      <w:hyperlink w:history="1" r:id="rIdqqao-ve_97gchwhdxewtz">
+      <w:hyperlink w:history="1" r:id="rIdnt1vhw1hp1h5wm5kexbze">
         <w:r>
           <w:rPr>
             <w:color w:val="1155CC"/>
@@ -2310,7 +2310,7 @@
         </w:rPr>
         <w:t xml:space="preserve">Keep a small journal with you throughout the day. Make 2 to 4 entries per day that include something you did, said or were thinking of saying and the feeling (or feelings) you experienced at that moment. Again, later on, when you have time, sit down with the </w:t>
       </w:r>
-      <w:hyperlink w:history="1" r:id="rIdkuktvmnrbrbtbhbfuhdsr">
+      <w:hyperlink w:history="1" r:id="rIdgqkrq6lrdesggoaknive2">
         <w:r>
           <w:rPr>
             <w:color w:val="1155CC"/>
@@ -2367,7 +2367,7 @@
         </w:rPr>
         <w:t xml:space="preserve"> at the top of the </w:t>
       </w:r>
-      <w:hyperlink w:history="1" r:id="rIdfir6tgbvvj6tqkryi-got">
+      <w:hyperlink w:history="1" r:id="rIdiaznh2s5pfrjaxeuwrqum">
         <w:r>
           <w:rPr>
             <w:color w:val="1155CC"/>
@@ -2404,7 +2404,7 @@
         </w:rPr>
         <w:t xml:space="preserve">Then look at the </w:t>
       </w:r>
-      <w:hyperlink w:history="1" r:id="rId6dbkexkjmfr7_spxpwzhv">
+      <w:hyperlink w:history="1" r:id="rIdg7p9pfu9tcgswfiqkosbl">
         <w:r>
           <w:rPr>
             <w:color w:val="1155CC"/>
@@ -2425,7 +2425,7 @@
         </w:rPr>
         <w:t xml:space="preserve"> and see if you can figure out what need your feeling was about. Remember, here too, it's VERY important to limit the words you use to those on the </w:t>
       </w:r>
-      <w:hyperlink w:history="1" r:id="rIdpgel-tsfqqqo1il3_vli2">
+      <w:hyperlink w:history="1" r:id="rId576llli3n82k7onc2y6h-">
         <w:r>
           <w:rPr>
             <w:color w:val="1155CC"/>
@@ -2750,7 +2750,7 @@
       <w:r>
         <w:t xml:space="preserve">Read the </w:t>
       </w:r>
-      <w:hyperlink w:history="1" r:id="rId3yfigranmddlgcw1t1ynn">
+      <w:hyperlink w:history="1" r:id="rIdul1nzbaani-utnxxwszsl">
         <w:r>
           <w:rPr>
             <w:color w:val="1155CC"/>
@@ -2883,7 +2883,7 @@
       <w:r>
         <w:t xml:space="preserve">Print a copy of the </w:t>
       </w:r>
-      <w:hyperlink w:history="1" r:id="rIdt1ylimjhilvms8n7snrxo">
+      <w:hyperlink w:history="1" r:id="rIdas-oh8r-fvgzd41qk3vic">
         <w:r>
           <w:rPr>
             <w:color w:val="1155CC"/>
@@ -3048,7 +3048,7 @@
         </w:rPr>
         <w:t xml:space="preserve">Keep a small journal with you throughout the day. Make 1 to 5 entries per day that include an act or words spoken by someone and what need(s) you imagine they were trying to meet. Remember, it's VERY helpful to limit the words you use to those on the </w:t>
       </w:r>
-      <w:hyperlink w:history="1" r:id="rIdpu4fxuin11x3iv-de2aln">
+      <w:hyperlink w:history="1" r:id="rIdvbh4umo-osyu7-dqs9lit">
         <w:r>
           <w:rPr>
             <w:color w:val="1155CC"/>
@@ -3190,7 +3190,7 @@
         </w:rPr>
         <w:t xml:space="preserve">Think of someone that you think is preventing you from getting a need(s) met. Write down the need(s) from the </w:t>
       </w:r>
-      <w:hyperlink w:history="1" r:id="rIdahbnfuq0qob_-jhf7f_v5">
+      <w:hyperlink w:history="1" r:id="rId_hhpuqaw_2d1c3fxjejyn">
         <w:r>
           <w:rPr>
             <w:color w:val="1155CC"/>
@@ -3531,7 +3531,7 @@
         </w:rPr>
         <w:t xml:space="preserve">Visit: </w:t>
       </w:r>
-      <w:hyperlink w:history="1" r:id="rIdrp3e5spiqfzfe-7znlsr5">
+      <w:hyperlink w:history="1" r:id="rIdhsbyh5xgm2rraxdj85fza">
         <w:r>
           <w:rPr>
             <w:color w:val="1155CC"/>
@@ -3807,7 +3807,7 @@
         <w:keepLines/>
         <w:spacing w:after="60" w:before="0" w:line="276" w:lineRule="auto"/>
       </w:pPr>
-      <w:hyperlink w:history="1" r:id="rIdrr41dyb26-ngeag2n4sen">
+      <w:hyperlink w:history="1" r:id="rId5fravj-cn44anqr63pv-r">
         <w:r>
           <w:rPr>
             <w:color w:val="1155CC"/>
@@ -3818,6 +3818,33 @@
           <w:t xml:space="preserve">If you haven't already, Click Here to Join the GCN</w:t>
         </w:r>
       </w:hyperlink>
+    </w:p>
+    <w:p>
+      <w:pPr>
+        <w:keepLines/>
+        <w:spacing w:after="60" w:before="0" w:line="276" w:lineRule="auto"/>
+      </w:pPr>
+      <w:hyperlink w:history="1" r:id="rIdzmsy93gsjecwdgjrjhvkv">
+        <w:r>
+          <w:rPr>
+            <w:color w:val="1155CC"/>
+            <w:sz w:val="20"/>
+            <w:szCs w:val="20"/>
+            <w:u w:val="single"/>
+          </w:rPr>
+          <w:t xml:space="preserve">If you need help joining or signing in, Click Here</w:t>
+        </w:r>
+      </w:hyperlink>
+      <w:r>
+        <w:rPr>
+          <w:i w:val="false"/>
+          <w:iCs w:val="false"/>
+          <w:color w:val="2D2D2D"/>
+          <w:sz w:val="20"/>
+          <w:szCs w:val="20"/>
+        </w:rPr>
+        <w:t xml:space="preserve">.</w:t>
+      </w:r>
     </w:p>
     <w:tbl>
       <w:tblPr>
@@ -4138,7 +4165,7 @@
         </w:rPr>
         <w:t xml:space="preserve">Continue working with this exercise (</w:t>
       </w:r>
-      <w:hyperlink w:history="1" r:id="rId8bfe2y5yzaoltyje-pmjw">
+      <w:hyperlink w:history="1" r:id="rIdeu2rnmklvxz67bxt_j4gb">
         <w:r>
           <w:rPr>
             <w:color w:val="1155CC"/>
@@ -4449,7 +4476,7 @@
         </w:rPr>
         <w:t xml:space="preserve"> - take your time). Next, view or print a copy of the </w:t>
       </w:r>
-      <w:hyperlink w:history="1" r:id="rIdgznvcuvzt1wvp12mfuuwx">
+      <w:hyperlink w:history="1" r:id="rIdvddxup8tiywtakyjml4ni">
         <w:r>
           <w:rPr>
             <w:color w:val="1155CC"/>
@@ -4982,7 +5009,7 @@
         <w:keepLines/>
         <w:spacing w:after="60" w:before="0" w:line="276" w:lineRule="auto"/>
       </w:pPr>
-      <w:hyperlink w:history="1" r:id="rIdzkojhrqg93t21gqgqpzoh">
+      <w:hyperlink w:history="1" r:id="rId5rnyc5xnssyijx2rkyecr">
         <w:r>
           <w:rPr>
             <w:color w:val="1155CC"/>
@@ -4993,6 +5020,33 @@
           <w:t xml:space="preserve">If you haven't already, Click Here to Join the GCN</w:t>
         </w:r>
       </w:hyperlink>
+    </w:p>
+    <w:p>
+      <w:pPr>
+        <w:keepLines/>
+        <w:spacing w:after="60" w:before="0" w:line="276" w:lineRule="auto"/>
+      </w:pPr>
+      <w:hyperlink w:history="1" r:id="rIdpa0n9pewfolpppqqdjk97">
+        <w:r>
+          <w:rPr>
+            <w:color w:val="1155CC"/>
+            <w:sz w:val="20"/>
+            <w:szCs w:val="20"/>
+            <w:u w:val="single"/>
+          </w:rPr>
+          <w:t xml:space="preserve">If you need help joining or signing in, Click Here</w:t>
+        </w:r>
+      </w:hyperlink>
+      <w:r>
+        <w:rPr>
+          <w:i w:val="false"/>
+          <w:iCs w:val="false"/>
+          <w:color w:val="2D2D2D"/>
+          <w:sz w:val="20"/>
+          <w:szCs w:val="20"/>
+        </w:rPr>
+        <w:t xml:space="preserve">.</w:t>
+      </w:r>
     </w:p>
     <w:tbl>
       <w:tblPr>
@@ -5986,7 +6040,7 @@
         </w:rPr>
         <w:t xml:space="preserve">Then look at the </w:t>
       </w:r>
-      <w:hyperlink w:history="1" r:id="rIduv8cm5iq3hmdtpn3n0fbh">
+      <w:hyperlink w:history="1" r:id="rIdn7tvk2eocmynmaju9srkx">
         <w:r>
           <w:rPr>
             <w:color w:val="1155CC"/>
@@ -6640,7 +6694,7 @@
         </w:rPr>
         <w:t xml:space="preserve">Later on, when you have time, read over your journal for the day. Next, check in with yourself about how you feel as you think about those thoughts. Then look at the </w:t>
       </w:r>
-      <w:hyperlink w:history="1" r:id="rIdiwdar_jkei0zkcyvscy7n">
+      <w:hyperlink w:history="1" r:id="rIdlgjypvjzkajvipnaecsgr">
         <w:r>
           <w:rPr>
             <w:color w:val="1155CC"/>
@@ -7037,7 +7091,7 @@
         </w:rPr>
         <w:t xml:space="preserve"> response would be. What was that person feeling? What was that person needing, wanting to have more of, or yearning to experience? Check the </w:t>
       </w:r>
-      <w:hyperlink w:history="1" r:id="rIdaalvf_w246ietfz989ufa">
+      <w:hyperlink w:history="1" r:id="rIdxz5wgliprp9jy2egzgybd">
         <w:r>
           <w:rPr>
             <w:color w:val="1155CC"/>
@@ -7058,7 +7112,7 @@
         </w:rPr>
         <w:t xml:space="preserve"> and the </w:t>
       </w:r>
-      <w:hyperlink w:history="1" r:id="rIdyfgaewrw-hzmj_-nfphsj">
+      <w:hyperlink w:history="1" r:id="rIdotxlnnfhjagmtu7c4_ij3">
         <w:r>
           <w:rPr>
             <w:color w:val="1155CC"/>
@@ -7510,7 +7564,7 @@
               </w:rPr>
               <w:t xml:space="preserve"> (feeling from the </w:t>
             </w:r>
-            <w:hyperlink w:history="1" r:id="rId6i2liifbbnvxqvwbotees">
+            <w:hyperlink w:history="1" r:id="rIdx6grphw4vczmaqnvkd-f8">
               <w:r>
                 <w:rPr>
                   <w:color w:val="1155CC"/>
@@ -7551,7 +7605,7 @@
               </w:rPr>
               <w:t xml:space="preserve"> (need from the </w:t>
             </w:r>
-            <w:hyperlink w:history="1" r:id="rIddunqjpl6951zyzvhkcr0y">
+            <w:hyperlink w:history="1" r:id="rIdszmqt1hkljdm9w3ybzy0l">
               <w:r>
                 <w:rPr>
                   <w:color w:val="1155CC"/>
@@ -20673,7 +20727,7 @@
         </w:rPr>
         <w:t xml:space="preserve">You may want to find some quiet space and time for this exercise. Start by going to the </w:t>
       </w:r>
-      <w:hyperlink w:history="1" r:id="rIdnmgea_tkd8twdmwg1y9ib">
+      <w:hyperlink w:history="1" r:id="rIdu-1qoext3girlv40jffws">
         <w:r>
           <w:rPr>
             <w:color w:val="1155CC"/>
@@ -21296,7 +21350,7 @@
         </w:rPr>
         <w:t xml:space="preserve"> exercise at: </w:t>
       </w:r>
-      <w:hyperlink w:history="1" r:id="rIdl6ehea6vrxvtftebxbexv">
+      <w:hyperlink w:history="1" r:id="rId292pvce2knwkfhgnvjnwz">
         <w:r>
           <w:rPr>
             <w:color w:val="1155CC"/>
@@ -22096,7 +22150,7 @@
         </w:rPr>
         <w:t xml:space="preserve">Either at that time, or later on, write down a word (or words) from the </w:t>
       </w:r>
-      <w:hyperlink w:history="1" r:id="rIdrqnmrm2sekbd4mtdo3qzf">
+      <w:hyperlink w:history="1" r:id="rId99uvsu2p_2xz1eoxfrw5w">
         <w:r>
           <w:rPr>
             <w:color w:val="1155CC"/>
@@ -22133,7 +22187,7 @@
         </w:rPr>
         <w:t xml:space="preserve">Then look at the </w:t>
       </w:r>
-      <w:hyperlink w:history="1" r:id="rIdfmpz13rfxmbogtfc9hwes">
+      <w:hyperlink w:history="1" r:id="rIdrmmo5p8yvyr9glvnc7e9j">
         <w:r>
           <w:rPr>
             <w:color w:val="1155CC"/>
@@ -23665,7 +23719,7 @@
         </w:rPr>
         <w:t xml:space="preserve"> at </w:t>
       </w:r>
-      <w:hyperlink w:history="1" r:id="rId1sy8ceas_5etk7ptq2lqe">
+      <w:hyperlink w:history="1" r:id="rIdrhr5kx120oyitskgk5xqv">
         <w:r>
           <w:rPr>
             <w:color w:val="1155CC"/>
@@ -26466,7 +26520,7 @@
         </w:rPr>
         <w:t xml:space="preserve">Later on, when you have time, sit down with the </w:t>
       </w:r>
-      <w:hyperlink w:history="1" r:id="rId-a4kkz5e_kwtjdf9e12vq">
+      <w:hyperlink w:history="1" r:id="rIddk7jq-dkd_foqivh3popl">
         <w:r>
           <w:rPr>
             <w:color w:val="1155CC"/>
@@ -26487,7 +26541,7 @@
         </w:rPr>
         <w:t xml:space="preserve"> and see if you can figure out what need(s) you were in pain about. Translate your judgment words into need words. As usual, I suggest that you limit the words you use to those on the </w:t>
       </w:r>
-      <w:hyperlink w:history="1" r:id="rIduhpojneckjkab-smlb1-x">
+      <w:hyperlink w:history="1" r:id="rIdtzee6l-wb_a_bekrdfjeb">
         <w:r>
           <w:rPr>
             <w:color w:val="1155CC"/>

</xml_diff>